<commit_message>
Add Chapter 16, NIMCP: Building a Brain from the Book's Principles, with its Student Notes and Labs
Chapter 15 now points to Chapter 16 as the next chapter.

Co-Authored-By: Claude Opus 5.5 <noreply@anthropic.com>
</commit_message>
<xml_diff>
--- a/docs/book/Word/Chapter15/How_the_Brain_Learns_Chapter_15_A_Coherent_Model_of_the_Human_Brain.docx
+++ b/docs/book/Word/Chapter15/How_the_Brain_Learns_Chapter_15_A_Coherent_Model_of_the_Human_Brain.docx
@@ -263,7 +263,7 @@
         <w:pStyle w:val="BodyText"/>
       </w:pPr>
       <w:r>
-        <w:t xml:space="preserve">The lesson of both papers is that understanding a system requires a model of how its parts relate, not only more data about the parts. This book has gathered the parts one chapter at a time: cells and their chemistry, signals and synapses, neuromodulators, circuits, plasticity, perception, emotion, decision, habit, the comparison with machines, prediction, constraint, and the consequences for daily life. This last chapter assembles them into a single model of how the brain learns. The model is not an equation. It is a small set of claims about how the parts fit together, each of which can be checked against the evidence of the earlier chapters and each of which could turn out to be wrong.</w:t>
+        <w:t xml:space="preserve">The lesson of both papers is that understanding a system requires a model of how its parts relate, not only more data about the parts. This book has gathered the parts one chapter at a time: cells and their chemistry, signals and synapses, neuromodulators, circuits, plasticity, perception, emotion, decision, habit, the comparison with machines, prediction, constraint, and the consequences for daily life. This chapter assembles them into a single model of how the brain learns. The model is not an equation. It is a small set of claims about how the parts fit together, each of which can be checked against the evidence of the earlier chapters and each of which could turn out to be wrong.</w:t>
       </w:r>
     </w:p>
     <w:bookmarkEnd w:id="22"/>
@@ -1388,16 +1388,34 @@
       </w:r>
     </w:p>
     <w:bookmarkEnd w:id="71"/>
-    <w:bookmarkStart w:id="75" w:name="references-and-attribution"/>
+    <w:bookmarkStart w:id="72" w:name="next-chapter"/>
     <w:p>
       <w:pPr>
         <w:pStyle w:val="Heading1"/>
       </w:pPr>
       <w:r>
+        <w:t xml:space="preserve">Next Chapter</w:t>
+      </w:r>
+    </w:p>
+    <w:p>
+      <w:pPr>
+        <w:pStyle w:val="FirstParagraph"/>
+      </w:pPr>
+      <w:r>
+        <w:t xml:space="preserve">Chapter 16: NIMCP: Building a Brain from the Book’s Principles</w:t>
+      </w:r>
+    </w:p>
+    <w:bookmarkEnd w:id="72"/>
+    <w:bookmarkStart w:id="76" w:name="references-and-attribution"/>
+    <w:p>
+      <w:pPr>
+        <w:pStyle w:val="Heading1"/>
+      </w:pPr>
+      <w:r>
         <w:t xml:space="preserve">References and Attribution</w:t>
       </w:r>
     </w:p>
-    <w:bookmarkStart w:id="72" w:name="figure-attribution"/>
+    <w:bookmarkStart w:id="73" w:name="figure-attribution"/>
     <w:p>
       <w:pPr>
         <w:pStyle w:val="Heading2"/>
@@ -1414,8 +1432,8 @@
         <w:t xml:space="preserve">Figures 15.1 to 15.5 were drawn for this book. Figure 15.4 plots published counts: the nematode worm’s 302 neurons and about 7,000 synapses; the fruit fly brain of Dorkenwald et al. (2024); the cubic millimeter of mouse visual cortex of the MICrONS Consortium (2025), for which the count is of all cells; the cubic millimeter of human temporal cortex of Shapson-Coe et al. (2024), for which the count is of neurons; and estimates for the whole human brain from Azevedo et al. (2009) for neurons and Tang et al. (2001) for synapses in the neocortex. Figures 15.1, 15.2, 15.3, and 15.5 are schematic; the assignments in Figures 15.2 and 15.5 are the author’s judgment of the evidence presented across the book.</w:t>
       </w:r>
     </w:p>
-    <w:bookmarkEnd w:id="72"/>
-    <w:bookmarkStart w:id="73" w:name="epigraph"/>
+    <w:bookmarkEnd w:id="73"/>
+    <w:bookmarkStart w:id="74" w:name="epigraph"/>
     <w:p>
       <w:pPr>
         <w:pStyle w:val="Heading2"/>
@@ -1476,8 +1494,8 @@
         <w:t xml:space="preserve">, translated by Neely Swanson and Larry W. Swanson (MIT Press, 1999).</w:t>
       </w:r>
     </w:p>
-    <w:bookmarkEnd w:id="73"/>
-    <w:bookmarkStart w:id="74" w:name="references"/>
+    <w:bookmarkEnd w:id="74"/>
+    <w:bookmarkStart w:id="75" w:name="references"/>
     <w:p>
       <w:pPr>
         <w:pStyle w:val="Heading2"/>
@@ -2140,8 +2158,8 @@
         <w:t xml:space="preserve">, 344(6188), 1173–1178.</w:t>
       </w:r>
     </w:p>
-    <w:bookmarkEnd w:id="74"/>
     <w:bookmarkEnd w:id="75"/>
+    <w:bookmarkEnd w:id="76"/>
     <w:sectPr>
       <w:pgSz w:h="15840" w:w="12240"/>
       <w:pgMar w:bottom="1440" w:left="1440" w:right="1440" w:top="1440"/>

</xml_diff>